<commit_message>
Completed the Arrays and Strings Theory
</commit_message>
<xml_diff>
--- a/docs/Arrays and Strings.docx
+++ b/docs/Arrays and Strings.docx
@@ -458,6 +458,1758 @@
           <w:rtl w:val="0"/>
         </w:rPr>
         <w:t xml:space="preserve">Student[] students = new Student[3];</w:t>
+      </w:r>
+    </w:p>
+    <w:p>
+      <w:pPr>
+        <w:rPr/>
+      </w:pPr>
+      <w:r>
+        <w:rPr>
+          <w:rtl w:val="0"/>
+        </w:rPr>
+      </w:r>
+    </w:p>
+    <w:p>
+      <w:pPr>
+        <w:rPr/>
+      </w:pPr>
+      <w:r>
+        <w:pict>
+          <v:rect style="width:0.0pt;height:1.5pt" o:hr="t" o:hrstd="t" o:hralign="center" fillcolor="#A0A0A0" stroked="f"/>
+        </w:pict>
+      </w:r>
+      <w:r>
+        <w:rPr>
+          <w:rtl w:val="0"/>
+        </w:rPr>
+      </w:r>
+    </w:p>
+    <w:p>
+      <w:pPr>
+        <w:pStyle w:val="Heading3"/>
+        <w:keepNext w:val="0"/>
+        <w:keepLines w:val="0"/>
+        <w:spacing w:before="280" w:lineRule="auto"/>
+        <w:rPr>
+          <w:b w:val="1"/>
+          <w:bCs w:val="1"/>
+          <w:color w:val="000000"/>
+          <w:sz w:val="26"/>
+          <w:szCs w:val="26"/>
+        </w:rPr>
+      </w:pPr>
+      <w:bookmarkStart w:colFirst="0" w:colLast="0" w:name="_t0wzkluaoy3k" w:id="8"/>
+      <w:bookmarkEnd w:id="8"/>
+      <w:r>
+        <w:rPr>
+          <w:b w:val="1"/>
+          <w:bCs w:val="1"/>
+          <w:color w:val="000000"/>
+          <w:sz w:val="26"/>
+          <w:szCs w:val="26"/>
+          <w:rtl w:val="0"/>
+        </w:rPr>
+        <w:t xml:space="preserve">Q42. What is an array of objects?</w:t>
+      </w:r>
+    </w:p>
+    <w:p>
+      <w:pPr>
+        <w:spacing w:after="240" w:before="240" w:lineRule="auto"/>
+        <w:rPr/>
+      </w:pPr>
+      <w:r>
+        <w:rPr>
+          <w:b w:val="1"/>
+          <w:bCs w:val="1"/>
+          <w:rtl w:val="0"/>
+        </w:rPr>
+        <w:t xml:space="preserve">Answer:</w:t>
+        <w:br w:type="textWrapping"/>
+      </w:r>
+      <w:r>
+        <w:rPr>
+          <w:rtl w:val="0"/>
+        </w:rPr>
+        <w:t xml:space="preserve"> An array of objects stores multiple object references of the same class.</w:t>
+      </w:r>
+    </w:p>
+    <w:p>
+      <w:pPr>
+        <w:spacing w:after="240" w:before="240" w:lineRule="auto"/>
+        <w:rPr/>
+      </w:pPr>
+      <w:r>
+        <w:rPr>
+          <w:rtl w:val="0"/>
+        </w:rPr>
+        <w:t xml:space="preserve">Example:</w:t>
+      </w:r>
+    </w:p>
+    <w:p>
+      <w:pPr>
+        <w:rPr/>
+      </w:pPr>
+      <w:r>
+        <w:rPr>
+          <w:rtl w:val="0"/>
+        </w:rPr>
+        <w:t xml:space="preserve">Student[] students = new Student[3];</w:t>
+      </w:r>
+    </w:p>
+    <w:p>
+      <w:pPr>
+        <w:rPr/>
+      </w:pPr>
+      <w:r>
+        <w:pict>
+          <v:rect style="width:0.0pt;height:1.5pt" o:hr="t" o:hrstd="t" o:hralign="center" fillcolor="#A0A0A0" stroked="f"/>
+        </w:pict>
+      </w:r>
+      <w:r>
+        <w:rPr>
+          <w:rtl w:val="0"/>
+        </w:rPr>
+      </w:r>
+    </w:p>
+    <w:p>
+      <w:pPr>
+        <w:pStyle w:val="Heading3"/>
+        <w:keepNext w:val="0"/>
+        <w:keepLines w:val="0"/>
+        <w:spacing w:before="280" w:lineRule="auto"/>
+        <w:rPr>
+          <w:b w:val="1"/>
+          <w:bCs w:val="1"/>
+          <w:color w:val="000000"/>
+          <w:sz w:val="26"/>
+          <w:szCs w:val="26"/>
+        </w:rPr>
+      </w:pPr>
+      <w:bookmarkStart w:colFirst="0" w:colLast="0" w:name="_gl7c3evr0jpx" w:id="9"/>
+      <w:bookmarkEnd w:id="9"/>
+      <w:r>
+        <w:rPr>
+          <w:b w:val="1"/>
+          <w:bCs w:val="1"/>
+          <w:color w:val="000000"/>
+          <w:sz w:val="26"/>
+          <w:szCs w:val="26"/>
+          <w:rtl w:val="0"/>
+        </w:rPr>
+        <w:t xml:space="preserve">Q43. What is the String class in Java?</w:t>
+      </w:r>
+    </w:p>
+    <w:p>
+      <w:pPr>
+        <w:spacing w:after="240" w:before="240" w:lineRule="auto"/>
+        <w:rPr/>
+      </w:pPr>
+      <w:r>
+        <w:rPr>
+          <w:b w:val="1"/>
+          <w:bCs w:val="1"/>
+          <w:rtl w:val="0"/>
+        </w:rPr>
+        <w:t xml:space="preserve">Answer:</w:t>
+        <w:br w:type="textWrapping"/>
+      </w:r>
+      <w:r>
+        <w:rPr>
+          <w:rtl w:val="0"/>
+        </w:rPr>
+        <w:t xml:space="preserve"> The </w:t>
+      </w:r>
+      <w:r>
+        <w:rPr>
+          <w:rFonts w:ascii="Roboto Mono" w:cs="Roboto Mono" w:eastAsia="Roboto Mono" w:hAnsi="Roboto Mono"/>
+          <w:color w:val="188038"/>
+          <w:rtl w:val="0"/>
+        </w:rPr>
+        <w:t xml:space="preserve">String</w:t>
+      </w:r>
+      <w:r>
+        <w:rPr>
+          <w:rtl w:val="0"/>
+        </w:rPr>
+        <w:t xml:space="preserve"> class is used to create and manipulate immutable strings in Java.</w:t>
+      </w:r>
+    </w:p>
+    <w:p>
+      <w:pPr>
+        <w:spacing w:after="240" w:before="240" w:lineRule="auto"/>
+        <w:rPr/>
+      </w:pPr>
+      <w:r>
+        <w:rPr>
+          <w:rtl w:val="0"/>
+        </w:rPr>
+        <w:t xml:space="preserve">Example:</w:t>
+      </w:r>
+    </w:p>
+    <w:p>
+      <w:pPr>
+        <w:rPr/>
+      </w:pPr>
+      <w:r>
+        <w:rPr>
+          <w:rtl w:val="0"/>
+        </w:rPr>
+        <w:t xml:space="preserve">String name = "Het";</w:t>
+      </w:r>
+    </w:p>
+    <w:p>
+      <w:pPr>
+        <w:rPr/>
+      </w:pPr>
+      <w:r>
+        <w:pict>
+          <v:rect style="width:0.0pt;height:1.5pt" o:hr="t" o:hrstd="t" o:hralign="center" fillcolor="#A0A0A0" stroked="f"/>
+        </w:pict>
+      </w:r>
+      <w:r>
+        <w:rPr>
+          <w:rtl w:val="0"/>
+        </w:rPr>
+      </w:r>
+    </w:p>
+    <w:p>
+      <w:pPr>
+        <w:pStyle w:val="Heading3"/>
+        <w:keepNext w:val="0"/>
+        <w:keepLines w:val="0"/>
+        <w:spacing w:before="280" w:lineRule="auto"/>
+        <w:rPr>
+          <w:b w:val="1"/>
+          <w:bCs w:val="1"/>
+          <w:color w:val="000000"/>
+          <w:sz w:val="26"/>
+          <w:szCs w:val="26"/>
+        </w:rPr>
+      </w:pPr>
+      <w:bookmarkStart w:colFirst="0" w:colLast="0" w:name="_sjxd175m080w" w:id="10"/>
+      <w:bookmarkEnd w:id="10"/>
+      <w:r>
+        <w:rPr>
+          <w:b w:val="1"/>
+          <w:bCs w:val="1"/>
+          <w:color w:val="000000"/>
+          <w:sz w:val="26"/>
+          <w:szCs w:val="26"/>
+          <w:rtl w:val="0"/>
+        </w:rPr>
+        <w:t xml:space="preserve">Q44. What is the difference between String, StringBuffer, and StringBuilder?</w:t>
+      </w:r>
+    </w:p>
+    <w:p>
+      <w:pPr>
+        <w:spacing w:after="240" w:before="240" w:lineRule="auto"/>
+        <w:rPr>
+          <w:b w:val="1"/>
+          <w:bCs w:val="1"/>
+        </w:rPr>
+      </w:pPr>
+      <w:r>
+        <w:rPr>
+          <w:b w:val="1"/>
+          <w:bCs w:val="1"/>
+          <w:rtl w:val="0"/>
+        </w:rPr>
+        <w:t xml:space="preserve">Answer:</w:t>
+      </w:r>
+    </w:p>
+    <w:tbl>
+      <w:tblPr>
+        <w:tblStyle w:val="Table1"/>
+        <w:tblW w:w="5490.0" w:type="dxa"/>
+        <w:jc w:val="left"/>
+        <w:tblBorders>
+          <w:top w:color="000000" w:space="0" w:sz="0" w:val="nil"/>
+          <w:left w:color="000000" w:space="0" w:sz="0" w:val="nil"/>
+          <w:bottom w:color="000000" w:space="0" w:sz="0" w:val="nil"/>
+          <w:right w:color="000000" w:space="0" w:sz="0" w:val="nil"/>
+          <w:insideH w:color="000000" w:space="0" w:sz="0" w:val="nil"/>
+          <w:insideV w:color="000000" w:space="0" w:sz="0" w:val="nil"/>
+        </w:tblBorders>
+        <w:tblLayout w:type="fixed"/>
+        <w:tblLook w:val="0600"/>
+      </w:tblPr>
+      <w:tblGrid>
+        <w:gridCol w:w="1755"/>
+        <w:gridCol w:w="825"/>
+        <w:gridCol w:w="1275"/>
+        <w:gridCol w:w="1635"/>
+        <w:tblGridChange w:id="0">
+          <w:tblGrid>
+            <w:gridCol w:w="1755"/>
+            <w:gridCol w:w="825"/>
+            <w:gridCol w:w="1275"/>
+            <w:gridCol w:w="1635"/>
+          </w:tblGrid>
+        </w:tblGridChange>
+      </w:tblGrid>
+      <w:tr>
+        <w:trPr>
+          <w:cantSplit w:val="0"/>
+          <w:trHeight w:val="515" w:hRule="atLeast"/>
+          <w:tblHeader w:val="0"/>
+        </w:trPr>
+        <w:tc>
+          <w:tcPr>
+            <w:tcBorders>
+              <w:top w:color="000000" w:space="0" w:sz="0" w:val="nil"/>
+              <w:left w:color="000000" w:space="0" w:sz="0" w:val="nil"/>
+              <w:bottom w:color="000000" w:space="0" w:sz="0" w:val="nil"/>
+              <w:right w:color="000000" w:space="0" w:sz="0" w:val="nil"/>
+            </w:tcBorders>
+            <w:tcMar>
+              <w:top w:w="100.0" w:type="dxa"/>
+              <w:left w:w="100.0" w:type="dxa"/>
+              <w:bottom w:w="100.0" w:type="dxa"/>
+              <w:right w:w="100.0" w:type="dxa"/>
+            </w:tcMar>
+            <w:vAlign w:val="top"/>
+          </w:tcPr>
+          <w:p>
+            <w:pPr>
+              <w:jc w:val="center"/>
+              <w:rPr/>
+            </w:pPr>
+            <w:r>
+              <w:rPr>
+                <w:b w:val="1"/>
+                <w:bCs w:val="1"/>
+                <w:rtl w:val="0"/>
+              </w:rPr>
+              <w:t xml:space="preserve">Feature</w:t>
+            </w:r>
+            <w:r>
+              <w:rPr>
+                <w:rtl w:val="0"/>
+              </w:rPr>
+            </w:r>
+          </w:p>
+        </w:tc>
+        <w:tc>
+          <w:tcPr>
+            <w:tcBorders>
+              <w:top w:color="000000" w:space="0" w:sz="0" w:val="nil"/>
+              <w:left w:color="000000" w:space="0" w:sz="0" w:val="nil"/>
+              <w:bottom w:color="000000" w:space="0" w:sz="0" w:val="nil"/>
+              <w:right w:color="000000" w:space="0" w:sz="0" w:val="nil"/>
+            </w:tcBorders>
+            <w:tcMar>
+              <w:top w:w="100.0" w:type="dxa"/>
+              <w:left w:w="100.0" w:type="dxa"/>
+              <w:bottom w:w="100.0" w:type="dxa"/>
+              <w:right w:w="100.0" w:type="dxa"/>
+            </w:tcMar>
+            <w:vAlign w:val="top"/>
+          </w:tcPr>
+          <w:p>
+            <w:pPr>
+              <w:jc w:val="center"/>
+              <w:rPr/>
+            </w:pPr>
+            <w:r>
+              <w:rPr>
+                <w:b w:val="1"/>
+                <w:bCs w:val="1"/>
+                <w:rtl w:val="0"/>
+              </w:rPr>
+              <w:t xml:space="preserve">String</w:t>
+            </w:r>
+            <w:r>
+              <w:rPr>
+                <w:rtl w:val="0"/>
+              </w:rPr>
+            </w:r>
+          </w:p>
+        </w:tc>
+        <w:tc>
+          <w:tcPr>
+            <w:tcBorders>
+              <w:top w:color="000000" w:space="0" w:sz="0" w:val="nil"/>
+              <w:left w:color="000000" w:space="0" w:sz="0" w:val="nil"/>
+              <w:bottom w:color="000000" w:space="0" w:sz="0" w:val="nil"/>
+              <w:right w:color="000000" w:space="0" w:sz="0" w:val="nil"/>
+            </w:tcBorders>
+            <w:tcMar>
+              <w:top w:w="100.0" w:type="dxa"/>
+              <w:left w:w="100.0" w:type="dxa"/>
+              <w:bottom w:w="100.0" w:type="dxa"/>
+              <w:right w:w="100.0" w:type="dxa"/>
+            </w:tcMar>
+            <w:vAlign w:val="top"/>
+          </w:tcPr>
+          <w:p>
+            <w:pPr>
+              <w:jc w:val="center"/>
+              <w:rPr/>
+            </w:pPr>
+            <w:r>
+              <w:rPr>
+                <w:b w:val="1"/>
+                <w:bCs w:val="1"/>
+                <w:rtl w:val="0"/>
+              </w:rPr>
+              <w:t xml:space="preserve">StringBuffer</w:t>
+            </w:r>
+            <w:r>
+              <w:rPr>
+                <w:rtl w:val="0"/>
+              </w:rPr>
+            </w:r>
+          </w:p>
+        </w:tc>
+        <w:tc>
+          <w:tcPr>
+            <w:tcBorders>
+              <w:top w:color="000000" w:space="0" w:sz="0" w:val="nil"/>
+              <w:left w:color="000000" w:space="0" w:sz="0" w:val="nil"/>
+              <w:bottom w:color="000000" w:space="0" w:sz="0" w:val="nil"/>
+              <w:right w:color="000000" w:space="0" w:sz="0" w:val="nil"/>
+            </w:tcBorders>
+            <w:tcMar>
+              <w:top w:w="100.0" w:type="dxa"/>
+              <w:left w:w="100.0" w:type="dxa"/>
+              <w:bottom w:w="100.0" w:type="dxa"/>
+              <w:right w:w="100.0" w:type="dxa"/>
+            </w:tcMar>
+            <w:vAlign w:val="top"/>
+          </w:tcPr>
+          <w:p>
+            <w:pPr>
+              <w:jc w:val="center"/>
+              <w:rPr/>
+            </w:pPr>
+            <w:r>
+              <w:rPr>
+                <w:b w:val="1"/>
+                <w:bCs w:val="1"/>
+                <w:rtl w:val="0"/>
+              </w:rPr>
+              <w:t xml:space="preserve">StringBuilder</w:t>
+            </w:r>
+            <w:r>
+              <w:rPr>
+                <w:rtl w:val="0"/>
+              </w:rPr>
+            </w:r>
+          </w:p>
+        </w:tc>
+      </w:tr>
+      <w:tr>
+        <w:trPr>
+          <w:cantSplit w:val="0"/>
+          <w:trHeight w:val="515" w:hRule="atLeast"/>
+          <w:tblHeader w:val="0"/>
+        </w:trPr>
+        <w:tc>
+          <w:tcPr>
+            <w:tcBorders>
+              <w:top w:color="000000" w:space="0" w:sz="0" w:val="nil"/>
+              <w:left w:color="000000" w:space="0" w:sz="0" w:val="nil"/>
+              <w:bottom w:color="000000" w:space="0" w:sz="0" w:val="nil"/>
+              <w:right w:color="000000" w:space="0" w:sz="0" w:val="nil"/>
+            </w:tcBorders>
+            <w:tcMar>
+              <w:top w:w="100.0" w:type="dxa"/>
+              <w:left w:w="100.0" w:type="dxa"/>
+              <w:bottom w:w="100.0" w:type="dxa"/>
+              <w:right w:w="100.0" w:type="dxa"/>
+            </w:tcMar>
+            <w:vAlign w:val="top"/>
+          </w:tcPr>
+          <w:p>
+            <w:pPr>
+              <w:rPr/>
+            </w:pPr>
+            <w:r>
+              <w:rPr>
+                <w:rtl w:val="0"/>
+              </w:rPr>
+              <w:t xml:space="preserve">Mutable</w:t>
+            </w:r>
+          </w:p>
+        </w:tc>
+        <w:tc>
+          <w:tcPr>
+            <w:tcBorders>
+              <w:top w:color="000000" w:space="0" w:sz="0" w:val="nil"/>
+              <w:left w:color="000000" w:space="0" w:sz="0" w:val="nil"/>
+              <w:bottom w:color="000000" w:space="0" w:sz="0" w:val="nil"/>
+              <w:right w:color="000000" w:space="0" w:sz="0" w:val="nil"/>
+            </w:tcBorders>
+            <w:tcMar>
+              <w:top w:w="100.0" w:type="dxa"/>
+              <w:left w:w="100.0" w:type="dxa"/>
+              <w:bottom w:w="100.0" w:type="dxa"/>
+              <w:right w:w="100.0" w:type="dxa"/>
+            </w:tcMar>
+            <w:vAlign w:val="top"/>
+          </w:tcPr>
+          <w:p>
+            <w:pPr>
+              <w:rPr/>
+            </w:pPr>
+            <w:r>
+              <w:rPr>
+                <w:rtl w:val="0"/>
+              </w:rPr>
+              <w:t xml:space="preserve">No</w:t>
+            </w:r>
+          </w:p>
+        </w:tc>
+        <w:tc>
+          <w:tcPr>
+            <w:tcBorders>
+              <w:top w:color="000000" w:space="0" w:sz="0" w:val="nil"/>
+              <w:left w:color="000000" w:space="0" w:sz="0" w:val="nil"/>
+              <w:bottom w:color="000000" w:space="0" w:sz="0" w:val="nil"/>
+              <w:right w:color="000000" w:space="0" w:sz="0" w:val="nil"/>
+            </w:tcBorders>
+            <w:tcMar>
+              <w:top w:w="100.0" w:type="dxa"/>
+              <w:left w:w="100.0" w:type="dxa"/>
+              <w:bottom w:w="100.0" w:type="dxa"/>
+              <w:right w:w="100.0" w:type="dxa"/>
+            </w:tcMar>
+            <w:vAlign w:val="top"/>
+          </w:tcPr>
+          <w:p>
+            <w:pPr>
+              <w:rPr/>
+            </w:pPr>
+            <w:r>
+              <w:rPr>
+                <w:rtl w:val="0"/>
+              </w:rPr>
+              <w:t xml:space="preserve">Yes</w:t>
+            </w:r>
+          </w:p>
+        </w:tc>
+        <w:tc>
+          <w:tcPr>
+            <w:tcBorders>
+              <w:top w:color="000000" w:space="0" w:sz="0" w:val="nil"/>
+              <w:left w:color="000000" w:space="0" w:sz="0" w:val="nil"/>
+              <w:bottom w:color="000000" w:space="0" w:sz="0" w:val="nil"/>
+              <w:right w:color="000000" w:space="0" w:sz="0" w:val="nil"/>
+            </w:tcBorders>
+            <w:tcMar>
+              <w:top w:w="100.0" w:type="dxa"/>
+              <w:left w:w="100.0" w:type="dxa"/>
+              <w:bottom w:w="100.0" w:type="dxa"/>
+              <w:right w:w="100.0" w:type="dxa"/>
+            </w:tcMar>
+            <w:vAlign w:val="top"/>
+          </w:tcPr>
+          <w:p>
+            <w:pPr>
+              <w:rPr/>
+            </w:pPr>
+            <w:r>
+              <w:rPr>
+                <w:rtl w:val="0"/>
+              </w:rPr>
+              <w:t xml:space="preserve">Yes</w:t>
+            </w:r>
+          </w:p>
+        </w:tc>
+      </w:tr>
+      <w:tr>
+        <w:trPr>
+          <w:cantSplit w:val="0"/>
+          <w:trHeight w:val="515" w:hRule="atLeast"/>
+          <w:tblHeader w:val="0"/>
+        </w:trPr>
+        <w:tc>
+          <w:tcPr>
+            <w:tcBorders>
+              <w:top w:color="000000" w:space="0" w:sz="0" w:val="nil"/>
+              <w:left w:color="000000" w:space="0" w:sz="0" w:val="nil"/>
+              <w:bottom w:color="000000" w:space="0" w:sz="0" w:val="nil"/>
+              <w:right w:color="000000" w:space="0" w:sz="0" w:val="nil"/>
+            </w:tcBorders>
+            <w:tcMar>
+              <w:top w:w="100.0" w:type="dxa"/>
+              <w:left w:w="100.0" w:type="dxa"/>
+              <w:bottom w:w="100.0" w:type="dxa"/>
+              <w:right w:w="100.0" w:type="dxa"/>
+            </w:tcMar>
+            <w:vAlign w:val="top"/>
+          </w:tcPr>
+          <w:p>
+            <w:pPr>
+              <w:rPr/>
+            </w:pPr>
+            <w:r>
+              <w:rPr>
+                <w:rtl w:val="0"/>
+              </w:rPr>
+              <w:t xml:space="preserve">Thread Safe</w:t>
+            </w:r>
+          </w:p>
+        </w:tc>
+        <w:tc>
+          <w:tcPr>
+            <w:tcBorders>
+              <w:top w:color="000000" w:space="0" w:sz="0" w:val="nil"/>
+              <w:left w:color="000000" w:space="0" w:sz="0" w:val="nil"/>
+              <w:bottom w:color="000000" w:space="0" w:sz="0" w:val="nil"/>
+              <w:right w:color="000000" w:space="0" w:sz="0" w:val="nil"/>
+            </w:tcBorders>
+            <w:tcMar>
+              <w:top w:w="100.0" w:type="dxa"/>
+              <w:left w:w="100.0" w:type="dxa"/>
+              <w:bottom w:w="100.0" w:type="dxa"/>
+              <w:right w:w="100.0" w:type="dxa"/>
+            </w:tcMar>
+            <w:vAlign w:val="top"/>
+          </w:tcPr>
+          <w:p>
+            <w:pPr>
+              <w:rPr/>
+            </w:pPr>
+            <w:r>
+              <w:rPr>
+                <w:rtl w:val="0"/>
+              </w:rPr>
+              <w:t xml:space="preserve">No</w:t>
+            </w:r>
+          </w:p>
+        </w:tc>
+        <w:tc>
+          <w:tcPr>
+            <w:tcBorders>
+              <w:top w:color="000000" w:space="0" w:sz="0" w:val="nil"/>
+              <w:left w:color="000000" w:space="0" w:sz="0" w:val="nil"/>
+              <w:bottom w:color="000000" w:space="0" w:sz="0" w:val="nil"/>
+              <w:right w:color="000000" w:space="0" w:sz="0" w:val="nil"/>
+            </w:tcBorders>
+            <w:tcMar>
+              <w:top w:w="100.0" w:type="dxa"/>
+              <w:left w:w="100.0" w:type="dxa"/>
+              <w:bottom w:w="100.0" w:type="dxa"/>
+              <w:right w:w="100.0" w:type="dxa"/>
+            </w:tcMar>
+            <w:vAlign w:val="top"/>
+          </w:tcPr>
+          <w:p>
+            <w:pPr>
+              <w:rPr/>
+            </w:pPr>
+            <w:r>
+              <w:rPr>
+                <w:rtl w:val="0"/>
+              </w:rPr>
+              <w:t xml:space="preserve">Yes</w:t>
+            </w:r>
+          </w:p>
+        </w:tc>
+        <w:tc>
+          <w:tcPr>
+            <w:tcBorders>
+              <w:top w:color="000000" w:space="0" w:sz="0" w:val="nil"/>
+              <w:left w:color="000000" w:space="0" w:sz="0" w:val="nil"/>
+              <w:bottom w:color="000000" w:space="0" w:sz="0" w:val="nil"/>
+              <w:right w:color="000000" w:space="0" w:sz="0" w:val="nil"/>
+            </w:tcBorders>
+            <w:tcMar>
+              <w:top w:w="100.0" w:type="dxa"/>
+              <w:left w:w="100.0" w:type="dxa"/>
+              <w:bottom w:w="100.0" w:type="dxa"/>
+              <w:right w:w="100.0" w:type="dxa"/>
+            </w:tcMar>
+            <w:vAlign w:val="top"/>
+          </w:tcPr>
+          <w:p>
+            <w:pPr>
+              <w:rPr/>
+            </w:pPr>
+            <w:r>
+              <w:rPr>
+                <w:rtl w:val="0"/>
+              </w:rPr>
+              <w:t xml:space="preserve">No</w:t>
+            </w:r>
+          </w:p>
+        </w:tc>
+      </w:tr>
+      <w:tr>
+        <w:trPr>
+          <w:cantSplit w:val="0"/>
+          <w:trHeight w:val="515" w:hRule="atLeast"/>
+          <w:tblHeader w:val="0"/>
+        </w:trPr>
+        <w:tc>
+          <w:tcPr>
+            <w:tcBorders>
+              <w:top w:color="000000" w:space="0" w:sz="0" w:val="nil"/>
+              <w:left w:color="000000" w:space="0" w:sz="0" w:val="nil"/>
+              <w:bottom w:color="000000" w:space="0" w:sz="0" w:val="nil"/>
+              <w:right w:color="000000" w:space="0" w:sz="0" w:val="nil"/>
+            </w:tcBorders>
+            <w:tcMar>
+              <w:top w:w="100.0" w:type="dxa"/>
+              <w:left w:w="100.0" w:type="dxa"/>
+              <w:bottom w:w="100.0" w:type="dxa"/>
+              <w:right w:w="100.0" w:type="dxa"/>
+            </w:tcMar>
+            <w:vAlign w:val="top"/>
+          </w:tcPr>
+          <w:p>
+            <w:pPr>
+              <w:rPr/>
+            </w:pPr>
+            <w:r>
+              <w:rPr>
+                <w:rtl w:val="0"/>
+              </w:rPr>
+              <w:t xml:space="preserve">Performance</w:t>
+            </w:r>
+          </w:p>
+        </w:tc>
+        <w:tc>
+          <w:tcPr>
+            <w:tcBorders>
+              <w:top w:color="000000" w:space="0" w:sz="0" w:val="nil"/>
+              <w:left w:color="000000" w:space="0" w:sz="0" w:val="nil"/>
+              <w:bottom w:color="000000" w:space="0" w:sz="0" w:val="nil"/>
+              <w:right w:color="000000" w:space="0" w:sz="0" w:val="nil"/>
+            </w:tcBorders>
+            <w:tcMar>
+              <w:top w:w="100.0" w:type="dxa"/>
+              <w:left w:w="100.0" w:type="dxa"/>
+              <w:bottom w:w="100.0" w:type="dxa"/>
+              <w:right w:w="100.0" w:type="dxa"/>
+            </w:tcMar>
+            <w:vAlign w:val="top"/>
+          </w:tcPr>
+          <w:p>
+            <w:pPr>
+              <w:rPr/>
+            </w:pPr>
+            <w:r>
+              <w:rPr>
+                <w:rtl w:val="0"/>
+              </w:rPr>
+              <w:t xml:space="preserve">Slow</w:t>
+            </w:r>
+          </w:p>
+        </w:tc>
+        <w:tc>
+          <w:tcPr>
+            <w:tcBorders>
+              <w:top w:color="000000" w:space="0" w:sz="0" w:val="nil"/>
+              <w:left w:color="000000" w:space="0" w:sz="0" w:val="nil"/>
+              <w:bottom w:color="000000" w:space="0" w:sz="0" w:val="nil"/>
+              <w:right w:color="000000" w:space="0" w:sz="0" w:val="nil"/>
+            </w:tcBorders>
+            <w:tcMar>
+              <w:top w:w="100.0" w:type="dxa"/>
+              <w:left w:w="100.0" w:type="dxa"/>
+              <w:bottom w:w="100.0" w:type="dxa"/>
+              <w:right w:w="100.0" w:type="dxa"/>
+            </w:tcMar>
+            <w:vAlign w:val="top"/>
+          </w:tcPr>
+          <w:p>
+            <w:pPr>
+              <w:rPr/>
+            </w:pPr>
+            <w:r>
+              <w:rPr>
+                <w:rtl w:val="0"/>
+              </w:rPr>
+              <w:t xml:space="preserve">Medium</w:t>
+            </w:r>
+          </w:p>
+        </w:tc>
+        <w:tc>
+          <w:tcPr>
+            <w:tcBorders>
+              <w:top w:color="000000" w:space="0" w:sz="0" w:val="nil"/>
+              <w:left w:color="000000" w:space="0" w:sz="0" w:val="nil"/>
+              <w:bottom w:color="000000" w:space="0" w:sz="0" w:val="nil"/>
+              <w:right w:color="000000" w:space="0" w:sz="0" w:val="nil"/>
+            </w:tcBorders>
+            <w:tcMar>
+              <w:top w:w="100.0" w:type="dxa"/>
+              <w:left w:w="100.0" w:type="dxa"/>
+              <w:bottom w:w="100.0" w:type="dxa"/>
+              <w:right w:w="100.0" w:type="dxa"/>
+            </w:tcMar>
+            <w:vAlign w:val="top"/>
+          </w:tcPr>
+          <w:p>
+            <w:pPr>
+              <w:rPr/>
+            </w:pPr>
+            <w:r>
+              <w:rPr>
+                <w:rtl w:val="0"/>
+              </w:rPr>
+              <w:t xml:space="preserve">Fast</w:t>
+            </w:r>
+          </w:p>
+        </w:tc>
+      </w:tr>
+    </w:tbl>
+    <w:p>
+      <w:pPr>
+        <w:rPr/>
+      </w:pPr>
+      <w:r>
+        <w:pict>
+          <v:rect style="width:0.0pt;height:1.5pt" o:hr="t" o:hrstd="t" o:hralign="center" fillcolor="#A0A0A0" stroked="f"/>
+        </w:pict>
+      </w:r>
+      <w:r>
+        <w:rPr>
+          <w:rtl w:val="0"/>
+        </w:rPr>
+      </w:r>
+    </w:p>
+    <w:p>
+      <w:pPr>
+        <w:pStyle w:val="Heading3"/>
+        <w:keepNext w:val="0"/>
+        <w:keepLines w:val="0"/>
+        <w:spacing w:before="280" w:lineRule="auto"/>
+        <w:rPr>
+          <w:b w:val="1"/>
+          <w:bCs w:val="1"/>
+          <w:color w:val="000000"/>
+          <w:sz w:val="26"/>
+          <w:szCs w:val="26"/>
+        </w:rPr>
+      </w:pPr>
+      <w:bookmarkStart w:colFirst="0" w:colLast="0" w:name="_q1d3c6n9y3d" w:id="11"/>
+      <w:bookmarkEnd w:id="11"/>
+      <w:r>
+        <w:rPr>
+          <w:b w:val="1"/>
+          <w:bCs w:val="1"/>
+          <w:color w:val="000000"/>
+          <w:sz w:val="26"/>
+          <w:szCs w:val="26"/>
+          <w:rtl w:val="0"/>
+        </w:rPr>
+        <w:t xml:space="preserve">Q45. What is StringBuffer in Java?</w:t>
+      </w:r>
+    </w:p>
+    <w:p>
+      <w:pPr>
+        <w:spacing w:after="240" w:before="240" w:lineRule="auto"/>
+        <w:rPr/>
+      </w:pPr>
+      <w:r>
+        <w:rPr>
+          <w:b w:val="1"/>
+          <w:bCs w:val="1"/>
+          <w:rtl w:val="0"/>
+        </w:rPr>
+        <w:t xml:space="preserve">Answer:</w:t>
+        <w:br w:type="textWrapping"/>
+      </w:r>
+      <w:r>
+        <w:rPr>
+          <w:rtl w:val="0"/>
+        </w:rPr>
+        <w:t xml:space="preserve"> </w:t>
+      </w:r>
+      <w:r>
+        <w:rPr>
+          <w:rFonts w:ascii="Roboto Mono" w:cs="Roboto Mono" w:eastAsia="Roboto Mono" w:hAnsi="Roboto Mono"/>
+          <w:color w:val="188038"/>
+          <w:rtl w:val="0"/>
+        </w:rPr>
+        <w:t xml:space="preserve">StringBuffer</w:t>
+      </w:r>
+      <w:r>
+        <w:rPr>
+          <w:rtl w:val="0"/>
+        </w:rPr>
+        <w:t xml:space="preserve"> is a mutable class used to modify strings dynamically. It is thread-safe.</w:t>
+      </w:r>
+    </w:p>
+    <w:p>
+      <w:pPr>
+        <w:spacing w:after="240" w:before="240" w:lineRule="auto"/>
+        <w:rPr/>
+      </w:pPr>
+      <w:r>
+        <w:rPr>
+          <w:rtl w:val="0"/>
+        </w:rPr>
+        <w:t xml:space="preserve">Example:</w:t>
+      </w:r>
+    </w:p>
+    <w:p>
+      <w:pPr>
+        <w:rPr/>
+      </w:pPr>
+      <w:r>
+        <w:rPr>
+          <w:rtl w:val="0"/>
+        </w:rPr>
+        <w:t xml:space="preserve">StringBuffer sb = new StringBuffer("Hello");</w:t>
+      </w:r>
+    </w:p>
+    <w:p>
+      <w:pPr>
+        <w:rPr/>
+      </w:pPr>
+      <w:r>
+        <w:rPr>
+          <w:rtl w:val="0"/>
+        </w:rPr>
+        <w:t xml:space="preserve">sb.append(" World");</w:t>
+      </w:r>
+    </w:p>
+    <w:p>
+      <w:pPr>
+        <w:rPr/>
+      </w:pPr>
+      <w:r>
+        <w:pict>
+          <v:rect style="width:0.0pt;height:1.5pt" o:hr="t" o:hrstd="t" o:hralign="center" fillcolor="#A0A0A0" stroked="f"/>
+        </w:pict>
+      </w:r>
+      <w:r>
+        <w:rPr>
+          <w:rtl w:val="0"/>
+        </w:rPr>
+      </w:r>
+    </w:p>
+    <w:p>
+      <w:pPr>
+        <w:pStyle w:val="Heading3"/>
+        <w:keepNext w:val="0"/>
+        <w:keepLines w:val="0"/>
+        <w:spacing w:before="280" w:lineRule="auto"/>
+        <w:rPr>
+          <w:b w:val="1"/>
+          <w:bCs w:val="1"/>
+          <w:color w:val="000000"/>
+          <w:sz w:val="26"/>
+          <w:szCs w:val="26"/>
+        </w:rPr>
+      </w:pPr>
+      <w:bookmarkStart w:colFirst="0" w:colLast="0" w:name="_n3nfmo1q9pls" w:id="12"/>
+      <w:bookmarkEnd w:id="12"/>
+      <w:r>
+        <w:rPr>
+          <w:b w:val="1"/>
+          <w:bCs w:val="1"/>
+          <w:color w:val="000000"/>
+          <w:sz w:val="26"/>
+          <w:szCs w:val="26"/>
+          <w:rtl w:val="0"/>
+        </w:rPr>
+        <w:t xml:space="preserve">Q46. What is StringBuilder in Java?</w:t>
+      </w:r>
+    </w:p>
+    <w:p>
+      <w:pPr>
+        <w:spacing w:after="240" w:before="240" w:lineRule="auto"/>
+        <w:rPr/>
+      </w:pPr>
+      <w:r>
+        <w:rPr>
+          <w:b w:val="1"/>
+          <w:bCs w:val="1"/>
+          <w:rtl w:val="0"/>
+        </w:rPr>
+        <w:t xml:space="preserve">Answer:</w:t>
+        <w:br w:type="textWrapping"/>
+      </w:r>
+      <w:r>
+        <w:rPr>
+          <w:rtl w:val="0"/>
+        </w:rPr>
+        <w:t xml:space="preserve"> </w:t>
+      </w:r>
+      <w:r>
+        <w:rPr>
+          <w:rFonts w:ascii="Roboto Mono" w:cs="Roboto Mono" w:eastAsia="Roboto Mono" w:hAnsi="Roboto Mono"/>
+          <w:color w:val="188038"/>
+          <w:rtl w:val="0"/>
+        </w:rPr>
+        <w:t xml:space="preserve">StringBuilder</w:t>
+      </w:r>
+      <w:r>
+        <w:rPr>
+          <w:rtl w:val="0"/>
+        </w:rPr>
+        <w:t xml:space="preserve"> is similar to </w:t>
+      </w:r>
+      <w:r>
+        <w:rPr>
+          <w:rFonts w:ascii="Roboto Mono" w:cs="Roboto Mono" w:eastAsia="Roboto Mono" w:hAnsi="Roboto Mono"/>
+          <w:color w:val="188038"/>
+          <w:rtl w:val="0"/>
+        </w:rPr>
+        <w:t xml:space="preserve">StringBuffer</w:t>
+      </w:r>
+      <w:r>
+        <w:rPr>
+          <w:rtl w:val="0"/>
+        </w:rPr>
+        <w:t xml:space="preserve"> but is not thread-safe and provides better performance.</w:t>
+      </w:r>
+    </w:p>
+    <w:p>
+      <w:pPr>
+        <w:spacing w:after="240" w:before="240" w:lineRule="auto"/>
+        <w:rPr/>
+      </w:pPr>
+      <w:r>
+        <w:rPr>
+          <w:rtl w:val="0"/>
+        </w:rPr>
+        <w:t xml:space="preserve">Example:</w:t>
+      </w:r>
+    </w:p>
+    <w:p>
+      <w:pPr>
+        <w:rPr/>
+      </w:pPr>
+      <w:r>
+        <w:rPr>
+          <w:rtl w:val="0"/>
+        </w:rPr>
+        <w:t xml:space="preserve">StringBuilder sb = new StringBuilder("Java");</w:t>
+      </w:r>
+    </w:p>
+    <w:p>
+      <w:pPr>
+        <w:rPr/>
+      </w:pPr>
+      <w:r>
+        <w:rPr>
+          <w:rtl w:val="0"/>
+        </w:rPr>
+        <w:t xml:space="preserve">sb.append(" Programming");</w:t>
+      </w:r>
+    </w:p>
+    <w:p>
+      <w:pPr>
+        <w:rPr/>
+      </w:pPr>
+      <w:r>
+        <w:pict>
+          <v:rect style="width:0.0pt;height:1.5pt" o:hr="t" o:hrstd="t" o:hralign="center" fillcolor="#A0A0A0" stroked="f"/>
+        </w:pict>
+      </w:r>
+      <w:r>
+        <w:rPr>
+          <w:rtl w:val="0"/>
+        </w:rPr>
+      </w:r>
+    </w:p>
+    <w:p>
+      <w:pPr>
+        <w:pStyle w:val="Heading3"/>
+        <w:keepNext w:val="0"/>
+        <w:keepLines w:val="0"/>
+        <w:spacing w:before="280" w:lineRule="auto"/>
+        <w:rPr>
+          <w:b w:val="1"/>
+          <w:bCs w:val="1"/>
+          <w:color w:val="000000"/>
+          <w:sz w:val="26"/>
+          <w:szCs w:val="26"/>
+        </w:rPr>
+      </w:pPr>
+      <w:bookmarkStart w:colFirst="0" w:colLast="0" w:name="_giz0akoumzkr" w:id="13"/>
+      <w:bookmarkEnd w:id="13"/>
+      <w:r>
+        <w:rPr>
+          <w:b w:val="1"/>
+          <w:bCs w:val="1"/>
+          <w:color w:val="000000"/>
+          <w:sz w:val="26"/>
+          <w:szCs w:val="26"/>
+          <w:rtl w:val="0"/>
+        </w:rPr>
+        <w:t xml:space="preserve">Q47. What is the </w:t>
+      </w:r>
+      <w:r>
+        <w:rPr>
+          <w:rFonts w:ascii="Roboto Mono" w:cs="Roboto Mono" w:eastAsia="Roboto Mono" w:hAnsi="Roboto Mono"/>
+          <w:b w:val="1"/>
+          <w:bCs w:val="1"/>
+          <w:color w:val="188038"/>
+          <w:sz w:val="26"/>
+          <w:szCs w:val="26"/>
+          <w:rtl w:val="0"/>
+        </w:rPr>
+        <w:t xml:space="preserve">length()</w:t>
+      </w:r>
+      <w:r>
+        <w:rPr>
+          <w:b w:val="1"/>
+          <w:bCs w:val="1"/>
+          <w:color w:val="000000"/>
+          <w:sz w:val="26"/>
+          <w:szCs w:val="26"/>
+          <w:rtl w:val="0"/>
+        </w:rPr>
+        <w:t xml:space="preserve"> method in Java?</w:t>
+      </w:r>
+    </w:p>
+    <w:p>
+      <w:pPr>
+        <w:spacing w:after="240" w:before="240" w:lineRule="auto"/>
+        <w:rPr/>
+      </w:pPr>
+      <w:r>
+        <w:rPr>
+          <w:b w:val="1"/>
+          <w:bCs w:val="1"/>
+          <w:rtl w:val="0"/>
+        </w:rPr>
+        <w:t xml:space="preserve">Answer:</w:t>
+        <w:br w:type="textWrapping"/>
+      </w:r>
+      <w:r>
+        <w:rPr>
+          <w:rtl w:val="0"/>
+        </w:rPr>
+        <w:t xml:space="preserve"> The </w:t>
+      </w:r>
+      <w:r>
+        <w:rPr>
+          <w:rFonts w:ascii="Roboto Mono" w:cs="Roboto Mono" w:eastAsia="Roboto Mono" w:hAnsi="Roboto Mono"/>
+          <w:color w:val="188038"/>
+          <w:rtl w:val="0"/>
+        </w:rPr>
+        <w:t xml:space="preserve">length()</w:t>
+      </w:r>
+      <w:r>
+        <w:rPr>
+          <w:rtl w:val="0"/>
+        </w:rPr>
+        <w:t xml:space="preserve"> method returns the number of characters in a string.</w:t>
+      </w:r>
+    </w:p>
+    <w:p>
+      <w:pPr>
+        <w:spacing w:after="240" w:before="240" w:lineRule="auto"/>
+        <w:rPr/>
+      </w:pPr>
+      <w:r>
+        <w:rPr>
+          <w:rtl w:val="0"/>
+        </w:rPr>
+        <w:t xml:space="preserve">Example:</w:t>
+      </w:r>
+    </w:p>
+    <w:p>
+      <w:pPr>
+        <w:rPr/>
+      </w:pPr>
+      <w:r>
+        <w:rPr>
+          <w:rtl w:val="0"/>
+        </w:rPr>
+        <w:t xml:space="preserve">String str = "Hello";</w:t>
+      </w:r>
+    </w:p>
+    <w:p>
+      <w:pPr>
+        <w:rPr/>
+      </w:pPr>
+      <w:r>
+        <w:rPr>
+          <w:rtl w:val="0"/>
+        </w:rPr>
+        <w:t xml:space="preserve">System.out.println(str.length());</w:t>
+      </w:r>
+    </w:p>
+    <w:p>
+      <w:pPr>
+        <w:rPr/>
+      </w:pPr>
+      <w:r>
+        <w:pict>
+          <v:rect style="width:0.0pt;height:1.5pt" o:hr="t" o:hrstd="t" o:hralign="center" fillcolor="#A0A0A0" stroked="f"/>
+        </w:pict>
+      </w:r>
+      <w:r>
+        <w:rPr>
+          <w:rtl w:val="0"/>
+        </w:rPr>
+      </w:r>
+    </w:p>
+    <w:p>
+      <w:pPr>
+        <w:pStyle w:val="Heading3"/>
+        <w:keepNext w:val="0"/>
+        <w:keepLines w:val="0"/>
+        <w:spacing w:before="280" w:lineRule="auto"/>
+        <w:rPr>
+          <w:b w:val="1"/>
+          <w:bCs w:val="1"/>
+          <w:color w:val="000000"/>
+          <w:sz w:val="26"/>
+          <w:szCs w:val="26"/>
+        </w:rPr>
+      </w:pPr>
+      <w:bookmarkStart w:colFirst="0" w:colLast="0" w:name="_4qevgaleni0k" w:id="14"/>
+      <w:bookmarkEnd w:id="14"/>
+      <w:r>
+        <w:rPr>
+          <w:b w:val="1"/>
+          <w:bCs w:val="1"/>
+          <w:color w:val="000000"/>
+          <w:sz w:val="26"/>
+          <w:szCs w:val="26"/>
+          <w:rtl w:val="0"/>
+        </w:rPr>
+        <w:t xml:space="preserve">Q48. What is the </w:t>
+      </w:r>
+      <w:r>
+        <w:rPr>
+          <w:rFonts w:ascii="Roboto Mono" w:cs="Roboto Mono" w:eastAsia="Roboto Mono" w:hAnsi="Roboto Mono"/>
+          <w:b w:val="1"/>
+          <w:bCs w:val="1"/>
+          <w:color w:val="188038"/>
+          <w:sz w:val="26"/>
+          <w:szCs w:val="26"/>
+          <w:rtl w:val="0"/>
+        </w:rPr>
+        <w:t xml:space="preserve">charAt()</w:t>
+      </w:r>
+      <w:r>
+        <w:rPr>
+          <w:b w:val="1"/>
+          <w:bCs w:val="1"/>
+          <w:color w:val="000000"/>
+          <w:sz w:val="26"/>
+          <w:szCs w:val="26"/>
+          <w:rtl w:val="0"/>
+        </w:rPr>
+        <w:t xml:space="preserve"> method in Java?</w:t>
+      </w:r>
+    </w:p>
+    <w:p>
+      <w:pPr>
+        <w:spacing w:after="240" w:before="240" w:lineRule="auto"/>
+        <w:rPr/>
+      </w:pPr>
+      <w:r>
+        <w:rPr>
+          <w:b w:val="1"/>
+          <w:bCs w:val="1"/>
+          <w:rtl w:val="0"/>
+        </w:rPr>
+        <w:t xml:space="preserve">Answer:</w:t>
+        <w:br w:type="textWrapping"/>
+      </w:r>
+      <w:r>
+        <w:rPr>
+          <w:rtl w:val="0"/>
+        </w:rPr>
+        <w:t xml:space="preserve"> The </w:t>
+      </w:r>
+      <w:r>
+        <w:rPr>
+          <w:rFonts w:ascii="Roboto Mono" w:cs="Roboto Mono" w:eastAsia="Roboto Mono" w:hAnsi="Roboto Mono"/>
+          <w:color w:val="188038"/>
+          <w:rtl w:val="0"/>
+        </w:rPr>
+        <w:t xml:space="preserve">charAt()</w:t>
+      </w:r>
+      <w:r>
+        <w:rPr>
+          <w:rtl w:val="0"/>
+        </w:rPr>
+        <w:t xml:space="preserve"> method returns the character at a specified index.</w:t>
+      </w:r>
+    </w:p>
+    <w:p>
+      <w:pPr>
+        <w:spacing w:after="240" w:before="240" w:lineRule="auto"/>
+        <w:rPr/>
+      </w:pPr>
+      <w:r>
+        <w:rPr>
+          <w:rtl w:val="0"/>
+        </w:rPr>
+        <w:t xml:space="preserve">Example:</w:t>
+      </w:r>
+    </w:p>
+    <w:p>
+      <w:pPr>
+        <w:rPr/>
+      </w:pPr>
+      <w:r>
+        <w:rPr>
+          <w:rtl w:val="0"/>
+        </w:rPr>
+        <w:t xml:space="preserve">String str = "Java";</w:t>
+      </w:r>
+    </w:p>
+    <w:p>
+      <w:pPr>
+        <w:rPr/>
+      </w:pPr>
+      <w:r>
+        <w:rPr>
+          <w:rtl w:val="0"/>
+        </w:rPr>
+        <w:t xml:space="preserve">System.out.println(str.charAt(1));</w:t>
+      </w:r>
+    </w:p>
+    <w:p>
+      <w:pPr>
+        <w:rPr/>
+      </w:pPr>
+      <w:r>
+        <w:pict>
+          <v:rect style="width:0.0pt;height:1.5pt" o:hr="t" o:hrstd="t" o:hralign="center" fillcolor="#A0A0A0" stroked="f"/>
+        </w:pict>
+      </w:r>
+      <w:r>
+        <w:rPr>
+          <w:rtl w:val="0"/>
+        </w:rPr>
+      </w:r>
+    </w:p>
+    <w:p>
+      <w:pPr>
+        <w:pStyle w:val="Heading3"/>
+        <w:keepNext w:val="0"/>
+        <w:keepLines w:val="0"/>
+        <w:spacing w:before="280" w:lineRule="auto"/>
+        <w:rPr>
+          <w:b w:val="1"/>
+          <w:bCs w:val="1"/>
+          <w:color w:val="000000"/>
+          <w:sz w:val="26"/>
+          <w:szCs w:val="26"/>
+        </w:rPr>
+      </w:pPr>
+      <w:bookmarkStart w:colFirst="0" w:colLast="0" w:name="_nb85dfkg2ig4" w:id="15"/>
+      <w:bookmarkEnd w:id="15"/>
+      <w:r>
+        <w:rPr>
+          <w:b w:val="1"/>
+          <w:bCs w:val="1"/>
+          <w:color w:val="000000"/>
+          <w:sz w:val="26"/>
+          <w:szCs w:val="26"/>
+          <w:rtl w:val="0"/>
+        </w:rPr>
+        <w:t xml:space="preserve">Q49. What is the </w:t>
+      </w:r>
+      <w:r>
+        <w:rPr>
+          <w:rFonts w:ascii="Roboto Mono" w:cs="Roboto Mono" w:eastAsia="Roboto Mono" w:hAnsi="Roboto Mono"/>
+          <w:b w:val="1"/>
+          <w:bCs w:val="1"/>
+          <w:color w:val="188038"/>
+          <w:sz w:val="26"/>
+          <w:szCs w:val="26"/>
+          <w:rtl w:val="0"/>
+        </w:rPr>
+        <w:t xml:space="preserve">substring()</w:t>
+      </w:r>
+      <w:r>
+        <w:rPr>
+          <w:b w:val="1"/>
+          <w:bCs w:val="1"/>
+          <w:color w:val="000000"/>
+          <w:sz w:val="26"/>
+          <w:szCs w:val="26"/>
+          <w:rtl w:val="0"/>
+        </w:rPr>
+        <w:t xml:space="preserve"> method in Java?</w:t>
+      </w:r>
+    </w:p>
+    <w:p>
+      <w:pPr>
+        <w:spacing w:after="240" w:before="240" w:lineRule="auto"/>
+        <w:rPr/>
+      </w:pPr>
+      <w:r>
+        <w:rPr>
+          <w:b w:val="1"/>
+          <w:bCs w:val="1"/>
+          <w:rtl w:val="0"/>
+        </w:rPr>
+        <w:t xml:space="preserve">Answer:</w:t>
+        <w:br w:type="textWrapping"/>
+      </w:r>
+      <w:r>
+        <w:rPr>
+          <w:rtl w:val="0"/>
+        </w:rPr>
+        <w:t xml:space="preserve"> The </w:t>
+      </w:r>
+      <w:r>
+        <w:rPr>
+          <w:rFonts w:ascii="Roboto Mono" w:cs="Roboto Mono" w:eastAsia="Roboto Mono" w:hAnsi="Roboto Mono"/>
+          <w:color w:val="188038"/>
+          <w:rtl w:val="0"/>
+        </w:rPr>
+        <w:t xml:space="preserve">substring()</w:t>
+      </w:r>
+      <w:r>
+        <w:rPr>
+          <w:rtl w:val="0"/>
+        </w:rPr>
+        <w:t xml:space="preserve"> method extracts a portion of a string.</w:t>
+      </w:r>
+    </w:p>
+    <w:p>
+      <w:pPr>
+        <w:spacing w:after="240" w:before="240" w:lineRule="auto"/>
+        <w:rPr/>
+      </w:pPr>
+      <w:r>
+        <w:rPr>
+          <w:rtl w:val="0"/>
+        </w:rPr>
+        <w:t xml:space="preserve">Example:</w:t>
+      </w:r>
+    </w:p>
+    <w:p>
+      <w:pPr>
+        <w:rPr/>
+      </w:pPr>
+      <w:r>
+        <w:rPr>
+          <w:rtl w:val="0"/>
+        </w:rPr>
+        <w:t xml:space="preserve">String str = "Programming";</w:t>
+      </w:r>
+    </w:p>
+    <w:p>
+      <w:pPr>
+        <w:rPr/>
+      </w:pPr>
+      <w:r>
+        <w:rPr>
+          <w:rtl w:val="0"/>
+        </w:rPr>
+        <w:t xml:space="preserve">System.out.println(str.substring(0, 6));</w:t>
+      </w:r>
+    </w:p>
+    <w:p>
+      <w:pPr>
+        <w:rPr/>
+      </w:pPr>
+      <w:r>
+        <w:pict>
+          <v:rect style="width:0.0pt;height:1.5pt" o:hr="t" o:hrstd="t" o:hralign="center" fillcolor="#A0A0A0" stroked="f"/>
+        </w:pict>
+      </w:r>
+      <w:r>
+        <w:rPr>
+          <w:rtl w:val="0"/>
+        </w:rPr>
+      </w:r>
+    </w:p>
+    <w:p>
+      <w:pPr>
+        <w:pStyle w:val="Heading3"/>
+        <w:keepNext w:val="0"/>
+        <w:keepLines w:val="0"/>
+        <w:spacing w:before="280" w:lineRule="auto"/>
+        <w:rPr>
+          <w:b w:val="1"/>
+          <w:bCs w:val="1"/>
+          <w:color w:val="000000"/>
+          <w:sz w:val="26"/>
+          <w:szCs w:val="26"/>
+        </w:rPr>
+      </w:pPr>
+      <w:bookmarkStart w:colFirst="0" w:colLast="0" w:name="_r1iwzhq0o0vf" w:id="16"/>
+      <w:bookmarkEnd w:id="16"/>
+      <w:r>
+        <w:rPr>
+          <w:b w:val="1"/>
+          <w:bCs w:val="1"/>
+          <w:color w:val="000000"/>
+          <w:sz w:val="26"/>
+          <w:szCs w:val="26"/>
+          <w:rtl w:val="0"/>
+        </w:rPr>
+        <w:t xml:space="preserve">Q50. What is the </w:t>
+      </w:r>
+      <w:r>
+        <w:rPr>
+          <w:rFonts w:ascii="Roboto Mono" w:cs="Roboto Mono" w:eastAsia="Roboto Mono" w:hAnsi="Roboto Mono"/>
+          <w:b w:val="1"/>
+          <w:bCs w:val="1"/>
+          <w:color w:val="188038"/>
+          <w:sz w:val="26"/>
+          <w:szCs w:val="26"/>
+          <w:rtl w:val="0"/>
+        </w:rPr>
+        <w:t xml:space="preserve">equals()</w:t>
+      </w:r>
+      <w:r>
+        <w:rPr>
+          <w:b w:val="1"/>
+          <w:bCs w:val="1"/>
+          <w:color w:val="000000"/>
+          <w:sz w:val="26"/>
+          <w:szCs w:val="26"/>
+          <w:rtl w:val="0"/>
+        </w:rPr>
+        <w:t xml:space="preserve"> method in Java?</w:t>
+      </w:r>
+    </w:p>
+    <w:p>
+      <w:pPr>
+        <w:spacing w:after="240" w:before="240" w:lineRule="auto"/>
+        <w:rPr/>
+      </w:pPr>
+      <w:r>
+        <w:rPr>
+          <w:b w:val="1"/>
+          <w:bCs w:val="1"/>
+          <w:rtl w:val="0"/>
+        </w:rPr>
+        <w:t xml:space="preserve">Answer:</w:t>
+        <w:br w:type="textWrapping"/>
+      </w:r>
+      <w:r>
+        <w:rPr>
+          <w:rtl w:val="0"/>
+        </w:rPr>
+        <w:t xml:space="preserve"> The </w:t>
+      </w:r>
+      <w:r>
+        <w:rPr>
+          <w:rFonts w:ascii="Roboto Mono" w:cs="Roboto Mono" w:eastAsia="Roboto Mono" w:hAnsi="Roboto Mono"/>
+          <w:color w:val="188038"/>
+          <w:rtl w:val="0"/>
+        </w:rPr>
+        <w:t xml:space="preserve">equals()</w:t>
+      </w:r>
+      <w:r>
+        <w:rPr>
+          <w:rtl w:val="0"/>
+        </w:rPr>
+        <w:t xml:space="preserve"> method compares the contents of two strings.</w:t>
+      </w:r>
+    </w:p>
+    <w:p>
+      <w:pPr>
+        <w:spacing w:after="240" w:before="240" w:lineRule="auto"/>
+        <w:rPr/>
+      </w:pPr>
+      <w:r>
+        <w:rPr>
+          <w:rtl w:val="0"/>
+        </w:rPr>
+        <w:t xml:space="preserve">Example:</w:t>
+      </w:r>
+    </w:p>
+    <w:p>
+      <w:pPr>
+        <w:rPr/>
+      </w:pPr>
+      <w:r>
+        <w:rPr>
+          <w:rtl w:val="0"/>
+        </w:rPr>
+        <w:t xml:space="preserve">String a = "Java";</w:t>
+      </w:r>
+    </w:p>
+    <w:p>
+      <w:pPr>
+        <w:rPr/>
+      </w:pPr>
+      <w:r>
+        <w:rPr>
+          <w:rtl w:val="0"/>
+        </w:rPr>
+        <w:t xml:space="preserve">String b = "Java";</w:t>
+      </w:r>
+    </w:p>
+    <w:p>
+      <w:pPr>
+        <w:rPr/>
+      </w:pPr>
+      <w:r>
+        <w:rPr>
+          <w:rtl w:val="0"/>
+        </w:rPr>
+      </w:r>
+    </w:p>
+    <w:p>
+      <w:pPr>
+        <w:rPr/>
+      </w:pPr>
+      <w:r>
+        <w:rPr>
+          <w:rtl w:val="0"/>
+        </w:rPr>
+        <w:t xml:space="preserve">System.out.println(a.equals(b));</w:t>
+      </w:r>
+    </w:p>
+    <w:p>
+      <w:pPr>
+        <w:rPr/>
+      </w:pPr>
+      <w:r>
+        <w:pict>
+          <v:rect style="width:0.0pt;height:1.5pt" o:hr="t" o:hrstd="t" o:hralign="center" fillcolor="#A0A0A0" stroked="f"/>
+        </w:pict>
+      </w:r>
+      <w:r>
+        <w:rPr>
+          <w:rtl w:val="0"/>
+        </w:rPr>
+      </w:r>
+    </w:p>
+    <w:p>
+      <w:pPr>
+        <w:pStyle w:val="Heading3"/>
+        <w:keepNext w:val="0"/>
+        <w:keepLines w:val="0"/>
+        <w:spacing w:before="280" w:lineRule="auto"/>
+        <w:rPr>
+          <w:b w:val="1"/>
+          <w:bCs w:val="1"/>
+          <w:color w:val="000000"/>
+          <w:sz w:val="26"/>
+          <w:szCs w:val="26"/>
+        </w:rPr>
+      </w:pPr>
+      <w:bookmarkStart w:colFirst="0" w:colLast="0" w:name="_5yx0q6lycxma" w:id="17"/>
+      <w:bookmarkEnd w:id="17"/>
+      <w:r>
+        <w:rPr>
+          <w:b w:val="1"/>
+          <w:bCs w:val="1"/>
+          <w:color w:val="000000"/>
+          <w:sz w:val="26"/>
+          <w:szCs w:val="26"/>
+          <w:rtl w:val="0"/>
+        </w:rPr>
+        <w:t xml:space="preserve">Q51. What is the </w:t>
+      </w:r>
+      <w:r>
+        <w:rPr>
+          <w:rFonts w:ascii="Roboto Mono" w:cs="Roboto Mono" w:eastAsia="Roboto Mono" w:hAnsi="Roboto Mono"/>
+          <w:b w:val="1"/>
+          <w:bCs w:val="1"/>
+          <w:color w:val="188038"/>
+          <w:sz w:val="26"/>
+          <w:szCs w:val="26"/>
+          <w:rtl w:val="0"/>
+        </w:rPr>
+        <w:t xml:space="preserve">compareTo()</w:t>
+      </w:r>
+      <w:r>
+        <w:rPr>
+          <w:b w:val="1"/>
+          <w:bCs w:val="1"/>
+          <w:color w:val="000000"/>
+          <w:sz w:val="26"/>
+          <w:szCs w:val="26"/>
+          <w:rtl w:val="0"/>
+        </w:rPr>
+        <w:t xml:space="preserve"> method in Java?</w:t>
+      </w:r>
+    </w:p>
+    <w:p>
+      <w:pPr>
+        <w:spacing w:after="240" w:before="240" w:lineRule="auto"/>
+        <w:rPr/>
+      </w:pPr>
+      <w:r>
+        <w:rPr>
+          <w:b w:val="1"/>
+          <w:bCs w:val="1"/>
+          <w:rtl w:val="0"/>
+        </w:rPr>
+        <w:t xml:space="preserve">Answer:</w:t>
+        <w:br w:type="textWrapping"/>
+      </w:r>
+      <w:r>
+        <w:rPr>
+          <w:rtl w:val="0"/>
+        </w:rPr>
+        <w:t xml:space="preserve"> The </w:t>
+      </w:r>
+      <w:r>
+        <w:rPr>
+          <w:rFonts w:ascii="Roboto Mono" w:cs="Roboto Mono" w:eastAsia="Roboto Mono" w:hAnsi="Roboto Mono"/>
+          <w:color w:val="188038"/>
+          <w:rtl w:val="0"/>
+        </w:rPr>
+        <w:t xml:space="preserve">compareTo()</w:t>
+      </w:r>
+      <w:r>
+        <w:rPr>
+          <w:rtl w:val="0"/>
+        </w:rPr>
+        <w:t xml:space="preserve"> method compares two strings lexicographically.</w:t>
+      </w:r>
+    </w:p>
+    <w:p>
+      <w:pPr>
+        <w:spacing w:after="240" w:before="240" w:lineRule="auto"/>
+        <w:rPr/>
+      </w:pPr>
+      <w:r>
+        <w:rPr>
+          <w:rtl w:val="0"/>
+        </w:rPr>
+        <w:t xml:space="preserve">Example:</w:t>
+      </w:r>
+    </w:p>
+    <w:p>
+      <w:pPr>
+        <w:rPr/>
+      </w:pPr>
+      <w:r>
+        <w:rPr>
+          <w:rtl w:val="0"/>
+        </w:rPr>
+        <w:t xml:space="preserve">String a = "Apple";</w:t>
+      </w:r>
+    </w:p>
+    <w:p>
+      <w:pPr>
+        <w:rPr/>
+      </w:pPr>
+      <w:r>
+        <w:rPr>
+          <w:rtl w:val="0"/>
+        </w:rPr>
+        <w:t xml:space="preserve">String b = "Banana";</w:t>
+      </w:r>
+    </w:p>
+    <w:p>
+      <w:pPr>
+        <w:rPr/>
+      </w:pPr>
+      <w:r>
+        <w:rPr>
+          <w:rtl w:val="0"/>
+        </w:rPr>
+      </w:r>
+    </w:p>
+    <w:p>
+      <w:pPr>
+        <w:rPr/>
+      </w:pPr>
+      <w:r>
+        <w:rPr>
+          <w:rtl w:val="0"/>
+        </w:rPr>
+        <w:t xml:space="preserve">System.out.println(a.compareTo(b));</w:t>
       </w:r>
     </w:p>
     <w:p>
@@ -647,6 +2399,14 @@
       <w:sz w:val="30"/>
       <w:szCs w:val="30"/>
     </w:rPr>
+  </w:style>
+  <w:style w:type="table" w:styleId="Table1">
+    <w:basedOn w:val="TableNormal"/>
+    <w:tblPr>
+      <w:tblStyleRowBandSize w:val="1"/>
+      <w:tblStyleColBandSize w:val="1"/>
+      <w:tblCellMar/>
+    </w:tblPr>
   </w:style>
 </w:styles>
 </file>

</xml_diff>